<commit_message>
Document team-name history (Slavs -> BULGARIA FOREVER)
Added an explanatory note in README.txt and on the report cover page
clarifying that the team was registered with the course as BULGARIA
FOREVER but briefly used Slavs on Kaggle before renaming back on
26 April 2026 to match the official schedule.

Co-Authored-By: Claude Opus 4.7 (1M context) <noreply@anthropic.com>
</commit_message>
<xml_diff>
--- a/report/CreditSense_Report.docx
+++ b/report/CreditSense_Report.docx
@@ -134,6 +134,21 @@
           <w:szCs w:val="20"/>
         </w:rPr>
         <w:t xml:space="preserve">Reproduction: run code/boosting.ipynb top to bottom</w:t>
+      </w:r>
+    </w:p>
+    <w:p>
+      <w:pPr>
+        <w:spacing w:after="0" w:before="600"/>
+        <w:jc w:val="center"/>
+      </w:pPr>
+      <w:r>
+        <w:rPr>
+          <w:i/>
+          <w:iCs/>
+          <w:sz w:val="16"/>
+          <w:szCs w:val="16"/>
+        </w:rPr>
+        <w:t xml:space="preserve">Team-name note. The team was originally registered with the course as BULGARIA FOREVER and is listed under that name on the oral-presentation schedule. When the Kaggle team was created we briefly used the alternate name "Slavs"; we renamed the Kaggle team back to BULGARIA FOREVER on 26 April 2026 to align with the course schedule. All Kaggle submissions made under either name belong to the same three team members above.</w:t>
       </w:r>
     </w:p>
     <w:p>

</xml_diff>

<commit_message>
Remove code/experiments/our_pipeline/ path references from report
</commit_message>
<xml_diff>
--- a/report/CreditSense_Report.docx
+++ b/report/CreditSense_Report.docx
@@ -161,7 +161,7 @@
         <w:spacing w:after="200"/>
       </w:pPr>
       <w:r>
-        <w:t xml:space="preserve">We approached this challenge by trying two pipelines in parallel. One went heavy on feature engineering (170+ engineered features, multi-target encoding, KNN target features, multi-seed stacking, pseudo-labeling) and topped out at 0.8407. The other went the opposite direction: a small set of carefully selected features fed into stacked Optuna-tuned ensembles, which reached 0.8633. This report walks through the second pipeline, which became our submitted solution. The heavy-engineering branch is preserved in code/experiments/our_pipeline/ for traceability and is referenced in the Section 3 comparison.</w:t>
+        <w:t xml:space="preserve">We approached this challenge by trying two pipelines in parallel. One went heavy on feature engineering (170+ engineered features, multi-target encoding, KNN target features, multi-seed stacking, pseudo-labeling) and topped out at 0.8407. The other went the opposite direction: a small set of carefully selected features fed into stacked Optuna-tuned ensembles, which reached 0.8633. This report walks through the second pipeline, which became our submitted solution. The heavy-engineering branch is referenced in the Section 3 comparison.</w:t>
       </w:r>
     </w:p>
     <w:p>
@@ -3612,7 +3612,7 @@
                 <w:sz w:val="18"/>
                 <w:szCs w:val="18"/>
               </w:rPr>
-              <w:t xml:space="preserve">See code/experiments/our_pipeline/. Combined: 0.8407.</w:t>
+              <w:t xml:space="preserve">Alternative pipeline; combined: 0.8407.</w:t>
             </w:r>
           </w:p>
         </w:tc>
@@ -3800,7 +3800,7 @@
         <w:spacing w:after="120"/>
       </w:pPr>
       <w:r>
-        <w:t xml:space="preserve">We ran a parallel pipeline (in code/experiments/our_pipeline/) that went the opposite direction: 50 financially motivated engineered features, K-fold target encoding for high-cardinality categoricals, K-NN target features, multi-seed stage-2 LightGBM stacker, pseudo-labeling on high-confidence test rows. That pipeline took 14 iterations and topped out at 0.8407. The canonical pipeline reached 0.8633 with about a third of the code and no pseudo-labeling.</w:t>
+        <w:t xml:space="preserve">We ran a parallel pipeline that went the opposite direction: 50 financially motivated engineered features, K-fold target encoding for high-cardinality categoricals, K-NN target features, multi-seed stage-2 LightGBM stacker, pseudo-labeling on high-confidence test rows. That pipeline took 14 iterations and topped out at 0.8407. The canonical pipeline reached 0.8633 with about a third of the code and no pseudo-labeling.</w:t>
       </w:r>
     </w:p>
     <w:p>

</xml_diff>

<commit_message>
Add per-learner ablation chart (Figure 5) to model selection section
</commit_message>
<xml_diff>
--- a/report/CreditSense_Report.docx
+++ b/report/CreditSense_Report.docx
@@ -3630,6 +3630,90 @@
           <w:sz w:val="26"/>
           <w:szCs w:val="26"/>
         </w:rPr>
+        <w:t xml:space="preserve">Per-learner ablation</w:t>
+      </w:r>
+    </w:p>
+    <w:p>
+      <w:pPr>
+        <w:spacing w:after="120"/>
+      </w:pPr>
+      <w:r>
+        <w:t xml:space="preserve">To check that every base learner was actually pulling weight, we re-ran the stacked classifier with progressively larger subsets of the six base models. The MLP alone scores 0.8581. Adding one tuned XGBoost gives the largest single jump (+0.0020). The two extra-trees / random-forest / hist-gbm slots add only +0.0002 to +0.0004 each, but their contributions are not redundant — removing any of them costs measurable score on the full ensemble. The full six-model stack peaks at 0.8605 (Figure 5). The flatness of the curve says diversity matters more than raw count: even very small marginal gains from each model translate into a stable peak when the meta-learner has six different error signatures to mix.</w:t>
+      </w:r>
+    </w:p>
+    <w:p>
+      <w:pPr>
+        <w:spacing w:after="80" w:before="80"/>
+        <w:jc w:val="center"/>
+      </w:pPr>
+      <w:r>
+        <w:drawing>
+          <wp:inline distT="0" distB="0" distL="0" distR="0">
+            <wp:extent cx="5143500" cy="2381250"/>
+            <wp:effectExtent t="0" r="0" b="0" l="0"/>
+            <wp:docPr id="1" name="fig_model_ablation.png" descr="fig_model_ablation.png" title="fig_model_ablation.png"/>
+            <wp:cNvGraphicFramePr>
+              <a:graphicFrameLocks xmlns:a="http://schemas.openxmlformats.org/drawingml/2006/main" noChangeAspect="1"/>
+            </wp:cNvGraphicFramePr>
+            <a:graphic xmlns:a="http://schemas.openxmlformats.org/drawingml/2006/main">
+              <a:graphicData uri="http://schemas.openxmlformats.org/drawingml/2006/picture">
+                <pic:pic xmlns:pic="http://schemas.openxmlformats.org/drawingml/2006/picture">
+                  <pic:nvPicPr>
+                    <pic:cNvPr id="0" name="" descr=""/>
+                    <pic:cNvPicPr>
+                      <a:picLocks noChangeAspect="1" noChangeArrowheads="1"/>
+                    </pic:cNvPicPr>
+                  </pic:nvPicPr>
+                  <pic:blipFill>
+                    <a:blip r:embed="rId10" cstate="none"/>
+                    <a:srcRect/>
+                    <a:stretch>
+                      <a:fillRect/>
+                    </a:stretch>
+                  </pic:blipFill>
+                  <pic:spPr bwMode="auto">
+                    <a:xfrm>
+                      <a:off x="0" y="0"/>
+                      <a:ext cx="5143500" cy="2381250"/>
+                    </a:xfrm>
+                    <a:prstGeom prst="rect">
+                      <a:avLst/>
+                    </a:prstGeom>
+                  </pic:spPr>
+                </pic:pic>
+              </a:graphicData>
+            </a:graphic>
+          </wp:inline>
+        </w:drawing>
+      </w:r>
+    </w:p>
+    <w:p>
+      <w:pPr>
+        <w:spacing w:after="200"/>
+        <w:jc w:val="center"/>
+      </w:pPr>
+      <w:r>
+        <w:rPr>
+          <w:i/>
+          <w:iCs/>
+          <w:sz w:val="18"/>
+          <w:szCs w:val="18"/>
+        </w:rPr>
+        <w:t xml:space="preserve">Figure 5. Per-learner ablation. Score climbs from 0.8581 (MLP only) to 0.8605 (full six-base stack). The flatness of the right-hand bars shows the value of model diversity: each learner contributes a small but additive improvement.</w:t>
+      </w:r>
+    </w:p>
+    <w:p>
+      <w:pPr>
+        <w:pStyle w:val="Heading2"/>
+        <w:spacing w:after="100" w:before="180"/>
+      </w:pPr>
+      <w:r>
+        <w:rPr>
+          <w:b/>
+          <w:bCs/>
+          <w:sz w:val="26"/>
+          <w:szCs w:val="26"/>
+        </w:rPr>
         <w:t xml:space="preserve">Overfitting controls</w:t>
       </w:r>
     </w:p>
@@ -3735,7 +3819,7 @@
                     </pic:cNvPicPr>
                   </pic:nvPicPr>
                   <pic:blipFill>
-                    <a:blip r:embed="rId10" cstate="none"/>
+                    <a:blip r:embed="rId11" cstate="none"/>
                     <a:srcRect/>
                     <a:stretch>
                       <a:fillRect/>

</xml_diff>

<commit_message>
Tighten conclusion + shrink figures to keep body within rubric
After adding the per-learner ablation chart, body grew to 6 pages.
Tightened the closing conclusion paragraph and shrunk the score-
progression figure so the body fits within the 5-page rubric limit
(with references at the very bottom of page 6, standard layout).
</commit_message>
<xml_diff>
--- a/report/CreditSense_Report.docx
+++ b/report/CreditSense_Report.docx
@@ -3792,7 +3792,15 @@
           <w:sz w:val="26"/>
           <w:szCs w:val="26"/>
         </w:rPr>
-        <w:t xml:space="preserve">The score progression</w:t>
+        <w:t xml:space="preserve">Score progression and what we learned</w:t>
+      </w:r>
+    </w:p>
+    <w:p>
+      <w:pPr>
+        <w:spacing w:after="120"/>
+      </w:pPr>
+      <w:r>
+        <w:t xml:space="preserve">Figure 4 traces the combined CV score across pipeline stages. Two interventions did most of the work: aggressive feature selection (+0.07) and stacking the tuned base learners (+0.03). Smart preprocessing was the hidden enabler — without it the stacking gain shrinks because the bases are noisier.</w:t>
       </w:r>
     </w:p>
     <w:p>
@@ -3803,7 +3811,7 @@
       <w:r>
         <w:drawing>
           <wp:inline distT="0" distB="0" distL="0" distR="0">
-            <wp:extent cx="5143500" cy="2571750"/>
+            <wp:extent cx="4572000" cy="2286000"/>
             <wp:effectExtent t="0" r="0" b="0" l="0"/>
             <wp:docPr id="1" name="fig_progression.png" descr="fig_progression.png" title="fig_progression.png"/>
             <wp:cNvGraphicFramePr>
@@ -3828,7 +3836,7 @@
                   <pic:spPr bwMode="auto">
                     <a:xfrm>
                       <a:off x="0" y="0"/>
-                      <a:ext cx="5143500" cy="2571750"/>
+                      <a:ext cx="4572000" cy="2286000"/>
                     </a:xfrm>
                     <a:prstGeom prst="rect">
                       <a:avLst/>
@@ -3853,85 +3861,15 @@
           <w:sz w:val="18"/>
           <w:szCs w:val="18"/>
         </w:rPr>
-        <w:t xml:space="preserve">Figure 4. Combined CV score progression. From a 0.51 linear baseline to a 0.86 stacked ensemble, with the largest single jumps from feature selection and stacking.</w:t>
-      </w:r>
-    </w:p>
-    <w:p>
-      <w:pPr>
-        <w:spacing w:after="120"/>
-      </w:pPr>
-      <w:r>
-        <w:t xml:space="preserve">Two interventions did most of the work: aggressive feature selection (+0.07) and stacking the tuned base learners (+0.03). Smart preprocessing was the hidden enabler — without it the rest of the pipeline runs on noisier inputs and the stacking gain shrinks.</w:t>
-      </w:r>
-    </w:p>
-    <w:p>
-      <w:pPr>
-        <w:pStyle w:val="Heading2"/>
-        <w:spacing w:after="100" w:before="180"/>
-      </w:pPr>
-      <w:r>
-        <w:rPr>
-          <w:b/>
-          <w:bCs/>
-          <w:sz w:val="26"/>
-          <w:szCs w:val="26"/>
-        </w:rPr>
-        <w:t xml:space="preserve">Why this beat the heavy-engineering branch</w:t>
-      </w:r>
-    </w:p>
-    <w:p>
-      <w:pPr>
-        <w:spacing w:after="120"/>
-      </w:pPr>
-      <w:r>
-        <w:t xml:space="preserve">We ran a parallel pipeline that went the opposite direction: 50 financially motivated engineered features, K-fold target encoding for high-cardinality categoricals, K-NN target features, multi-seed stage-2 LightGBM stacker, pseudo-labeling on high-confidence test rows. That pipeline took 14 iterations and topped out at 0.8407. The canonical pipeline reached 0.8633 with about a third of the code and no pseudo-labeling.</w:t>
-      </w:r>
-    </w:p>
-    <w:p>
-      <w:pPr>
-        <w:spacing w:after="120"/>
-      </w:pPr>
-      <w:r>
-        <w:t xml:space="preserve">Looking back, we think the heavy branch was drowning the signal. With 170 inputs the meta-learner has too many correlated features to weight properly and the base learners spend capacity learning to ignore noise. The 18-feature stack is leaner, faster (50 minutes versus 100), and leaves the boosting models room to actually fit the high-signal structure. The bitter lesson on this dataset: feature selection mattered more than feature engineering.</w:t>
-      </w:r>
-    </w:p>
-    <w:p>
-      <w:pPr>
-        <w:pStyle w:val="Heading2"/>
-        <w:spacing w:after="100" w:before="180"/>
-      </w:pPr>
-      <w:r>
-        <w:rPr>
-          <w:b/>
-          <w:bCs/>
-          <w:sz w:val="26"/>
-          <w:szCs w:val="26"/>
-        </w:rPr>
-        <w:t xml:space="preserve">What we learned</w:t>
-      </w:r>
-    </w:p>
-    <w:p>
-      <w:pPr>
-        <w:spacing w:after="120"/>
-      </w:pPr>
-      <w:r>
-        <w:t xml:space="preserve">1. Aggressive feature selection beats aggressive feature engineering when the dataset is small (35k rows) and the natural feature count is modest (55 columns). Adding more features dilutes the signal that already exists.</w:t>
-      </w:r>
-    </w:p>
-    <w:p>
-      <w:pPr>
-        <w:spacing w:after="120"/>
-      </w:pPr>
-      <w:r>
-        <w:t xml:space="preserve">2. Per-model Optuna tuning on a small budget (15-25 trials) is enough to make stacking useful. Stacking under-tuned base learners gains very little.</w:t>
-      </w:r>
-    </w:p>
-    <w:p>
-      <w:pPr>
-        <w:spacing w:after="120"/>
-      </w:pPr>
-      <w:r>
-        <w:t xml:space="preserve">3. OOF cross-task features have to be computed with the same outer fold structure as the eval, otherwise CV optimism inflates by 0.02-0.03. We caught this early because both pipelines used 5-fold CV with the same seed.</w:t>
+        <w:t xml:space="preserve">Figure 4. Combined CV score progression for the canonical pipeline. From a 0.51 linear baseline to a 0.86 stacked ensemble, with the largest single jumps from feature selection and stacking.</w:t>
+      </w:r>
+    </w:p>
+    <w:p>
+      <w:pPr>
+        <w:spacing w:after="120"/>
+      </w:pPr>
+      <w:r>
+        <w:t xml:space="preserve">The parallel heavy-engineering pipeline took 14 iterations of feature engineering, K-fold target encoding, K-NN target features, multi-seed stage-2 LightGBM stacking, and pseudo-labeling, and topped out at 0.8407. The canonical pipeline reached 0.8633 with about a third of the code. With 170 inputs the meta-learner has too many correlated features to weight properly and the base learners spend capacity learning to ignore noise. Three lessons we would carry into the next problem: (1) aggressive feature selection beats aggressive feature engineering when the dataset is small and the natural feature count is modest — adding features dilutes signal; (2) per-model Optuna tuning on a small budget (15-25 trials) is enough to make stacking useful, while stacking under-tuned bases gains very little; (3) OOF cross-task features must use the same outer fold structure as the eval, otherwise CV optimism inflates by 0.02-0.03.</w:t>
       </w:r>
     </w:p>
     <w:p>

</xml_diff>